<commit_message>
Actualiza documentación (Cómo Funciona y Planificación) para la versión 0.3
</commit_message>
<xml_diff>
--- a/Cómo Funciona_0.3.docx
+++ b/Cómo Funciona_0.3.docx
@@ -12,7 +12,7 @@
     </w:p>
     <w:p>
       <w:r>
-        <w:t>Última actualización: 14/06/2026</w:t>
+        <w:t>Última actualización: 25/06/2026</w:t>
       </w:r>
     </w:p>
     <w:p>
@@ -49,7 +49,7 @@
         <w:pStyle w:val="ListNumber"/>
       </w:pPr>
       <w:r>
-        <w:t>3. FacialGestureDetector convierte las métricas en gestos discretos usando calibración neutral adaptativa (primeros ~5 s) y debouncing por frames consecutivos.</w:t>
+        <w:t>3. FacialGestureDetector convierte las métricas en gestos discretos usando calibración neutral adaptativa (primeros ~5 s) y debouncing por frames consecutivos. Genera tanto booleanos de gesto como gesture_scores (score, confidence, margin, active_raw).</w:t>
       </w:r>
     </w:p>
     <w:p>
@@ -57,7 +57,7 @@
         <w:pStyle w:val="ListNumber"/>
       </w:pPr>
       <w:r>
-        <w:t>4. Los gestos activos se mapean a acciones del perfil activo (hotkeys, clicks) mediante gesture_mapper y HotkeyExecutor (pyautogui).</w:t>
+        <w:t>4. GestureArbiter filtra los gestos: resuelve conflictos dentro de grupos (boca, sonrisa, ojos, cejas), aplica estabilidad temporal configurable y en modo realtime usa active_raw + confianza alta para reducir latencia en acciones de teclado.</w:t>
       </w:r>
     </w:p>
     <w:p>
@@ -65,7 +65,7 @@
         <w:pStyle w:val="ListNumber"/>
       </w:pPr>
       <w:r>
-        <w:t>5. MouseController mueve el cursor según la posición relativa de la nariz respecto a un centro recalibrable. Aplica zona muerta, velocidad máxima y suavizado EMA.</w:t>
+        <w:t>5. Los gestos ganadores se mapean a acciones del perfil activo (hotkeys, key_hold, clicks) mediante gesture_mapper y HotkeyExecutor (pyautogui).</w:t>
       </w:r>
     </w:p>
     <w:p>
@@ -73,7 +73,7 @@
         <w:pStyle w:val="ListNumber"/>
       </w:pPr>
       <w:r>
-        <w:t>6. BlinkClickController detecta guiños unilaterales (un ojo cerrado, el otro abierto) y ejecuta click izquierdo (guiño izq.) o derecho (guiño der.).</w:t>
+        <w:t>6. MouseController mueve el cursor según la posición relativa de la nariz respecto a un centro recalibrable. Aplica zona muerta, velocidad máxima y suavizado EMA.</w:t>
       </w:r>
     </w:p>
     <w:p>
@@ -81,7 +81,23 @@
         <w:pStyle w:val="ListNumber"/>
       </w:pPr>
       <w:r>
-        <w:t>7. VoiceCommandController escucha audio en loop, clasifica módulo y comando con modelos ML (.pkl) y ejecuta la acción correspondiente.</w:t>
+        <w:t>7. BlinkClickController detecta guiños unilaterales (un ojo cerrado, el otro abierto) y ejecuta click izquierdo (guiño izq.) o derecho (guiño der.).</w:t>
+      </w:r>
+    </w:p>
+    <w:p>
+      <w:pPr>
+        <w:pStyle w:val="ListNumber"/>
+      </w:pPr>
+      <w:r>
+        <w:t>8. VoiceCommandController escucha audio en loop, clasifica módulo y comando con modelos ML (.pkl) y ejecuta la acción correspondiente.</w:t>
+      </w:r>
+    </w:p>
+    <w:p>
+      <w:pPr>
+        <w:pStyle w:val="ListNumber"/>
+      </w:pPr>
+      <w:r>
+        <w:t>9. GestureDiagnosticsLogger registra eventos de diagnóstico en archivos JSONL para análisis posterior de confusiones y ajuste de perfiles.</w:t>
       </w:r>
     </w:p>
     <w:p>
@@ -180,6 +196,233 @@
     <w:p>
       <w:r>
         <w:t>Cada gesto tiene: escala de umbral, delta mínimo absoluto (evita ruido de baseline) y contador de frames de debounce (N frames consecutivos antes de reportar). La base neutral se adapta lentamente (adaptation_alpha=0.01) cuando ningún gesto está activo.</w:t>
+      </w:r>
+    </w:p>
+    <w:p>
+      <w:r>
+        <w:t>Además de los booleanos tradicionales, el detector genera gesture_scores por gesto:</w:t>
+      </w:r>
+    </w:p>
+    <w:p>
+      <w:pPr>
+        <w:pStyle w:val="ListBullet"/>
+      </w:pPr>
+      <w:r>
+        <w:t>score: intensidad normalizada sobre el umbral.</w:t>
+      </w:r>
+    </w:p>
+    <w:p>
+      <w:pPr>
+        <w:pStyle w:val="ListBullet"/>
+      </w:pPr>
+      <w:r>
+        <w:t>threshold: umbral normalizado (siempre 1.0 en la escala interna).</w:t>
+      </w:r>
+    </w:p>
+    <w:p>
+      <w:pPr>
+        <w:pStyle w:val="ListBullet"/>
+      </w:pPr>
+      <w:r>
+        <w:t>margin: score - threshold (positivo = superó el umbral).</w:t>
+      </w:r>
+    </w:p>
+    <w:p>
+      <w:pPr>
+        <w:pStyle w:val="ListBullet"/>
+      </w:pPr>
+      <w:r>
+        <w:t>confidence: ratio score/threshold clampeado a [0, 1].</w:t>
+      </w:r>
+    </w:p>
+    <w:p>
+      <w:pPr>
+        <w:pStyle w:val="ListBullet"/>
+      </w:pPr>
+      <w:r>
+        <w:t>active_raw: True si el gesto superó el umbral antes del debounce.</w:t>
+      </w:r>
+    </w:p>
+    <w:p>
+      <w:pPr>
+        <w:pStyle w:val="ListBullet"/>
+      </w:pPr>
+      <w:r>
+        <w:t>detail: descripción de qué métricas contribuyeron al score.</w:t>
+      </w:r>
+    </w:p>
+    <w:p>
+      <w:pPr>
+        <w:pStyle w:val="Heading2"/>
+      </w:pPr>
+      <w:r>
+        <w:t>Arbitraje de gestos (GestureArbiter)</w:t>
+      </w:r>
+    </w:p>
+    <w:p>
+      <w:r>
+        <w:t>GestureArbiter recibe los booleanos y gesture_scores del detector y produce un único conjunto de gestos ganadores por frame. Sus responsabilidades son:</w:t>
+      </w:r>
+    </w:p>
+    <w:p>
+      <w:pPr>
+        <w:pStyle w:val="ListBullet"/>
+      </w:pPr>
+      <w:r>
+        <w:t>Resolver conflictos dentro de grupos (boca, sonrisa, ojos, cejas): solo un gesto del grupo puede estar activo. En caso de empate, desempata por confidence o priority.</w:t>
+      </w:r>
+    </w:p>
+    <w:p>
+      <w:pPr>
+        <w:pStyle w:val="ListBullet"/>
+      </w:pPr>
+      <w:r>
+        <w:t>Aplicar estabilidad temporal: activation_frames (frames consecutivos requeridos para activar) y release_frames (frames de ausencia requeridos para liberar). Gestos key_hold tienen hold_activation_frames y hold_release_frames independientes para menor latencia.</w:t>
+      </w:r>
+    </w:p>
+    <w:p>
+      <w:pPr>
+        <w:pStyle w:val="ListBullet"/>
+      </w:pPr>
+      <w:r>
+        <w:t>Modo realtime: si gesture_scores.active_raw=True y confidence &gt;= realtime_confidence y margin &gt;= realtime_margin, activa el gesto sin esperar el debounce completo del detector. Solo aplica a los tipos de acción listados en realtime_action_types (default: hotkey, key_hold).</w:t>
+      </w:r>
+    </w:p>
+    <w:p>
+      <w:pPr>
+        <w:pStyle w:val="ListBullet"/>
+      </w:pPr>
+      <w:r>
+        <w:t>Producir last_debug con candidatos, descartados, puntajes y frames de activación por grupo, para diagnóstico en vivo y logs.</w:t>
+      </w:r>
+    </w:p>
+    <w:p>
+      <w:r>
+        <w:t>Configuración relevante en gesture_arbitration (default_config.json):</w:t>
+      </w:r>
+    </w:p>
+    <w:p>
+      <w:r>
+        <w:t>"mode": "realtime" | "balanced"</w:t>
+        <w:br/>
+        <w:t>"realtime_confidence": 0.85  (umbral de confianza para fast path)</w:t>
+        <w:br/>
+        <w:t>"realtime_margin": 0.15  (margen mínimo sobre umbral)</w:t>
+        <w:br/>
+        <w:t>"realtime_action_types": ["hotkey", "key_hold"]</w:t>
+        <w:br/>
+        <w:t>"activation_frames": 2  (default para gestos normales)</w:t>
+        <w:br/>
+        <w:t>"hold_activation_frames": 1  (default para key_hold)</w:t>
+        <w:br/>
+        <w:t>"release_frames": 2  (default)</w:t>
+        <w:br/>
+        <w:t>"hold_release_frames": 1  (default para key_hold)</w:t>
+        <w:br/>
+        <w:t>"activation_frames_by_gesture": {"mouth_o": 3, "brow_raise": 3, ...}  (por gesto)</w:t>
+      </w:r>
+    </w:p>
+    <w:p>
+      <w:pPr>
+        <w:pStyle w:val="Heading2"/>
+      </w:pPr>
+      <w:r>
+        <w:t>Modos de acción por gesto</w:t>
+      </w:r>
+    </w:p>
+    <w:p>
+      <w:r>
+        <w:t>En Configuración → Gestos → Acciones, cada gesto puede configurarse con dos modos mediante un switch 'Mantener':</w:t>
+      </w:r>
+    </w:p>
+    <w:p>
+      <w:pPr>
+        <w:pStyle w:val="ListBullet"/>
+      </w:pPr>
+      <w:r>
+        <w:t>hotkey (switch apagado): pulsa la tecla una vez por cada activación del gesto. Útil para acciones discretas: Enter, Tab, Esc, atajos de teclado.</w:t>
+      </w:r>
+    </w:p>
+    <w:p>
+      <w:pPr>
+        <w:pStyle w:val="ListBullet"/>
+      </w:pPr>
+      <w:r>
+        <w:t>key_hold (switch encendido): mantiene la tecla presionada mientras el gesto esté activo y la suelta al terminar. Útil para movimiento continuo en juegos: flechas, WASD.</w:t>
+      </w:r>
+    </w:p>
+    <w:p>
+      <w:r>
+        <w:t>Para juegos, se recomienda usar key_hold con el perfil 'Juego simple'. Ese perfil activa hold_activation_frames=1 y hold_release_frames=1 y tiene un gesture_cooldown de 0.15 s para máxima respuesta. Las acciones discretas (saltar, confirmar) usan hotkey en el mismo perfil.</w:t>
+      </w:r>
+    </w:p>
+    <w:p>
+      <w:pPr>
+        <w:pStyle w:val="Heading2"/>
+      </w:pPr>
+      <w:r>
+        <w:t>Perfiles incluidos</w:t>
+      </w:r>
+    </w:p>
+    <w:p>
+      <w:pPr>
+        <w:pStyle w:val="ListBullet"/>
+      </w:pPr>
+      <w:r>
+        <w:t>navegacion: Acciones de edición y navegación (copiar, pegar, Enter, Tab, Eliminar, barra de url). Mouse habilitado.</w:t>
+      </w:r>
+    </w:p>
+    <w:p>
+      <w:pPr>
+        <w:pStyle w:val="ListBullet"/>
+      </w:pPr>
+      <w:r>
+        <w:t>accesibilidad_pc: Control de escritorio completo (Tab/Shift-Tab para controles, Enter para activar, Esc para volver, click/doble-click, PageUp/PageDown). Mouse habilitado.</w:t>
+      </w:r>
+    </w:p>
+    <w:p>
+      <w:pPr>
+        <w:pStyle w:val="ListBullet"/>
+      </w:pPr>
+      <w:r>
+        <w:t>juego_simple: Movimiento con key_hold (flechas), salto con space, confirmación con Enter, pausa con Esc. Cooldown de 0.15 s. Mouse deshabilitado.</w:t>
+      </w:r>
+    </w:p>
+    <w:p>
+      <w:pPr>
+        <w:pStyle w:val="Heading2"/>
+      </w:pPr>
+      <w:r>
+        <w:t>Cooldown configurable</w:t>
+      </w:r>
+    </w:p>
+    <w:p>
+      <w:r>
+        <w:t>El cooldown entre activaciones de un mismo gesto puede configurarse en tres niveles:</w:t>
+      </w:r>
+    </w:p>
+    <w:p>
+      <w:pPr>
+        <w:pStyle w:val="ListBullet"/>
+      </w:pPr>
+      <w:r>
+        <w:t>Global: gesture_cooldown en default_config.json (default 0.3 s). Aplica a todos los perfiles que no tengan override propio.</w:t>
+      </w:r>
+    </w:p>
+    <w:p>
+      <w:pPr>
+        <w:pStyle w:val="ListBullet"/>
+      </w:pPr>
+      <w:r>
+        <w:t>Por perfil: gesture_cooldown dentro de la sección del perfil en profiles. Permite que un perfil de juego use 0.15 s sin afectar los demás.</w:t>
+      </w:r>
+    </w:p>
+    <w:p>
+      <w:pPr>
+        <w:pStyle w:val="ListBullet"/>
+      </w:pPr>
+      <w:r>
+        <w:t>Sin cooldown para key_hold: las acciones de tipo key_hold no usan cooldown, ya que su activación y liberación dependen de si el gesto está activo.</w:t>
       </w:r>
     </w:p>
     <w:p>
@@ -284,6 +527,66 @@
         <w:pStyle w:val="Heading2"/>
       </w:pPr>
       <w:r>
+        <w:t>Diagnóstico en vivo y logs</w:t>
+      </w:r>
+    </w:p>
+    <w:p>
+      <w:r>
+        <w:t>La vista Inicio muestra una tarjeta de diagnóstico en tiempo real con:</w:t>
+      </w:r>
+    </w:p>
+    <w:p>
+      <w:pPr>
+        <w:pStyle w:val="ListBullet"/>
+      </w:pPr>
+      <w:r>
+        <w:t>Ganador: gesto filtrado por el árbitro que puede ejecutar una acción.</w:t>
+      </w:r>
+    </w:p>
+    <w:p>
+      <w:pPr>
+        <w:pStyle w:val="ListBullet"/>
+      </w:pPr>
+      <w:r>
+        <w:t>Crudos: gestos que el detector facial vio antes del arbitraje.</w:t>
+      </w:r>
+    </w:p>
+    <w:p>
+      <w:pPr>
+        <w:pStyle w:val="ListBullet"/>
+      </w:pPr>
+      <w:r>
+        <w:t>Descartados: gestos rechazados por competir con otro gesto del mismo grupo.</w:t>
+      </w:r>
+    </w:p>
+    <w:p>
+      <w:pPr>
+        <w:pStyle w:val="ListBullet"/>
+      </w:pPr>
+      <w:r>
+        <w:t>Frames de activación: cuántos frames lleva el candidato y cuántos necesita.</w:t>
+      </w:r>
+    </w:p>
+    <w:p>
+      <w:r>
+        <w:t>GestureDiagnosticsLogger guarda eventos en JSONL para revisión posterior:</w:t>
+      </w:r>
+    </w:p>
+    <w:p>
+      <w:r>
+        <w:t>Ruta: logs/gesture_diagnostics/gesture_diagnostics_ui_YYYYMMDD_HHMMSS.jsonl</w:t>
+      </w:r>
+    </w:p>
+    <w:p>
+      <w:r>
+        <w:t>Cada línea contiene: profile, detected_gesture, debug.raw_active, debug.active, debug.groups (candidatos, descartados, puntajes, frames requeridos). Configurable con min_interval_seconds y only_log_changes.</w:t>
+      </w:r>
+    </w:p>
+    <w:p>
+      <w:pPr>
+        <w:pStyle w:val="Heading2"/>
+      </w:pPr>
+      <w:r>
         <w:t>Interfaz de usuario (v0.3)</w:t>
       </w:r>
     </w:p>
@@ -297,7 +600,7 @@
         <w:pStyle w:val="ListBullet"/>
       </w:pPr>
       <w:r>
-        <w:t>Inicio: preview de cámara (hilo dedicado), badge de gesto detectado, métricas faciales (boca, ojos, cejas, sonrisa), estado de módulos (gestos/mouse/voz), panel 'Voz en vivo' (estado / módulo / comando / advertencia de confianza).</w:t>
+        <w:t>Inicio: preview de cámara (hilo dedicado), badge de gesto detectado, métricas faciales (boca, ojos, cejas, sonrisa), estado de módulos (gestos/mouse/voz), panel 'Voz en vivo' (estado / módulo / comando / advertencia de confianza), tarjeta de diagnóstico de gestos (ganador/crudos/descartados).</w:t>
       </w:r>
     </w:p>
     <w:p>
@@ -305,7 +608,7 @@
         <w:pStyle w:val="ListBullet"/>
       </w:pPr>
       <w:r>
-        <w:t>Configuración: tabs Gestos→Acciones / Perfiles / Mouse. Panel derecho con toggle de Control de voz, resumen de mouse (estado/velocidad/zona muerta/suavizado), chip de perfil activo y lista de otros perfiles.</w:t>
+        <w:t>Configuración: tabs Gestos→Acciones / Perfiles / Mouse. En Gestos→Acciones cada gesto muestra la tecla mapeada y un switch 'Mantener' (hotkey vs key_hold). Panel derecho con toggle de Control de voz, resumen de mouse y chip de perfil activo.</w:t>
       </w:r>
     </w:p>
     <w:p>
@@ -339,7 +642,7 @@
     </w:p>
     <w:p>
       <w:r>
-        <w:t>La configuración se persiste en config/user_settings.json (merge sobre default_config.json). Cada perfil contiene: gesture_thresholds, gesture_actions, voice_actions, mouse_settings. Los cambios se aplican sin reiniciar la app. Se pueden clonar perfiles.</w:t>
+        <w:t>La configuración se persiste en config/user_settings.json (merge sobre default_config.json). Cada perfil contiene: gesture_thresholds, gesture_actions (con type: hotkey o key_hold por gesto), voice_actions, mouse_settings y opcionalmente gesture_cooldown propio. Los cambios se aplican sin reiniciar la app.</w:t>
       </w:r>
     </w:p>
     <w:p>
@@ -399,7 +702,7 @@
           </w:tcPr>
           <w:p>
             <w:r>
-              <w:t>Ventana principal (~1900 líneas): UI + bucle de cámara + lógica de gestos/voz</w:t>
+              <w:t>Ventana principal: UI + bucle de cámara + lógica de gestos/voz/diagnóstico</w:t>
             </w:r>
           </w:p>
         </w:tc>
@@ -421,7 +724,7 @@
           </w:tcPr>
           <w:p>
             <w:r>
-              <w:t>Capa de acceso a config: get/set de perfiles, umbrales, mouse, voz</w:t>
+              <w:t>Capa de acceso a config: get/set de perfiles, umbrales, mouse, voz, cooldown</w:t>
             </w:r>
           </w:p>
         </w:tc>
@@ -443,7 +746,7 @@
           </w:tcPr>
           <w:p>
             <w:r>
-              <w:t>FacialGestureDetector con calibración neutral adaptativa</w:t>
+              <w:t>FacialGestureDetector: calibración neutral, debounce, gesture_scores</w:t>
             </w:r>
           </w:p>
         </w:tc>
@@ -466,6 +769,50 @@
           <w:p>
             <w:r>
               <w:t>MediaPipeFaceDetector (landmarks + blendshapes + nose_tip)</w:t>
+            </w:r>
+          </w:p>
+        </w:tc>
+      </w:tr>
+      <w:tr>
+        <w:tc>
+          <w:tcPr>
+            <w:tcW w:type="dxa" w:w="4320"/>
+          </w:tcPr>
+          <w:p>
+            <w:r>
+              <w:t>core/gesture_engine/gesture_arbiter.py</w:t>
+            </w:r>
+          </w:p>
+        </w:tc>
+        <w:tc>
+          <w:tcPr>
+            <w:tcW w:type="dxa" w:w="4320"/>
+          </w:tcPr>
+          <w:p>
+            <w:r>
+              <w:t>GestureArbiter: arbitraje, estabilidad, modo realtime, debug</w:t>
+            </w:r>
+          </w:p>
+        </w:tc>
+      </w:tr>
+      <w:tr>
+        <w:tc>
+          <w:tcPr>
+            <w:tcW w:type="dxa" w:w="4320"/>
+          </w:tcPr>
+          <w:p>
+            <w:r>
+              <w:t>core/gesture_engine/gesture_diagnostics_logger.py</w:t>
+            </w:r>
+          </w:p>
+        </w:tc>
+        <w:tc>
+          <w:tcPr>
+            <w:tcW w:type="dxa" w:w="4320"/>
+          </w:tcPr>
+          <w:p>
+            <w:r>
+              <w:t>GestureDiagnosticsLogger: logs JSONL de sesión</w:t>
             </w:r>
           </w:p>
         </w:tc>
@@ -553,7 +900,7 @@
           </w:tcPr>
           <w:p>
             <w:r>
-              <w:t>Ejecución de hotkeys/clicks con pyautogui</w:t>
+              <w:t>Ejecución de hotkeys/key_hold/clicks con pyautogui</w:t>
             </w:r>
           </w:p>
         </w:tc>
@@ -575,7 +922,7 @@
           </w:tcPr>
           <w:p>
             <w:r>
-              <w:t>Config por defecto: perfiles, umbrales, voz, mouse</w:t>
+              <w:t>Config por defecto: perfiles, umbrales, arbitraje, voz, mouse, cooldown</w:t>
             </w:r>
           </w:p>
         </w:tc>

</xml_diff>

<commit_message>
Fix: Migración a pydirectinput para soporte en juegos y mejoras en gestos asimétricos
</commit_message>
<xml_diff>
--- a/Cómo Funciona_0.3.docx
+++ b/Cómo Funciona_0.3.docx
@@ -12,7 +12,7 @@
     </w:p>
     <w:p>
       <w:r>
-        <w:t>Última actualización: 25/06/2026</w:t>
+        <w:t>Última actualización: 26/06/2026</w:t>
       </w:r>
     </w:p>
     <w:p>
@@ -49,7 +49,7 @@
         <w:pStyle w:val="ListNumber"/>
       </w:pPr>
       <w:r>
-        <w:t>3. FacialGestureDetector convierte las métricas en gestos discretos usando calibración neutral adaptativa (primeros ~5 s) y debouncing por frames consecutivos. Genera tanto booleanos de gesto como gesture_scores (score, confidence, margin, active_raw).</w:t>
+        <w:t>3. FacialGestureDetector convierte las métricas en gestos discretos usando calibración neutral adaptativa (primeros ~5 s) y debouncing por frames consecutivos.</w:t>
       </w:r>
     </w:p>
     <w:p>
@@ -57,7 +57,7 @@
         <w:pStyle w:val="ListNumber"/>
       </w:pPr>
       <w:r>
-        <w:t>4. GestureArbiter filtra los gestos: resuelve conflictos dentro de grupos (boca, sonrisa, ojos, cejas), aplica estabilidad temporal configurable y en modo realtime usa active_raw + confianza alta para reducir latencia en acciones de teclado.</w:t>
+        <w:t>4. Los gestos activos se mapean a acciones del perfil activo (hotkeys, clicks) mediante gesture_mapper y HotkeyExecutor (pydirectinput).</w:t>
       </w:r>
     </w:p>
     <w:p>
@@ -65,7 +65,7 @@
         <w:pStyle w:val="ListNumber"/>
       </w:pPr>
       <w:r>
-        <w:t>5. Los gestos ganadores se mapean a acciones del perfil activo (hotkeys, key_hold, clicks) mediante gesture_mapper y HotkeyExecutor (pyautogui).</w:t>
+        <w:t>5. MouseController mueve el cursor según la posición relativa de la nariz respecto a un centro recalibrable. Aplica zona muerta, velocidad máxima y suavizado EMA.</w:t>
       </w:r>
     </w:p>
     <w:p>
@@ -73,7 +73,7 @@
         <w:pStyle w:val="ListNumber"/>
       </w:pPr>
       <w:r>
-        <w:t>6. MouseController mueve el cursor según la posición relativa de la nariz respecto a un centro recalibrable. Aplica zona muerta, velocidad máxima y suavizado EMA.</w:t>
+        <w:t>6. BlinkClickController detecta guiños unilaterales (un ojo cerrado, el otro abierto) y ejecuta click izquierdo (guiño izq.) o derecho (guiño der.).</w:t>
       </w:r>
     </w:p>
     <w:p>
@@ -81,23 +81,7 @@
         <w:pStyle w:val="ListNumber"/>
       </w:pPr>
       <w:r>
-        <w:t>7. BlinkClickController detecta guiños unilaterales (un ojo cerrado, el otro abierto) y ejecuta click izquierdo (guiño izq.) o derecho (guiño der.).</w:t>
-      </w:r>
-    </w:p>
-    <w:p>
-      <w:pPr>
-        <w:pStyle w:val="ListNumber"/>
-      </w:pPr>
-      <w:r>
-        <w:t>8. VoiceCommandController escucha audio en loop, clasifica módulo y comando con modelos ML (.pkl) y ejecuta la acción correspondiente.</w:t>
-      </w:r>
-    </w:p>
-    <w:p>
-      <w:pPr>
-        <w:pStyle w:val="ListNumber"/>
-      </w:pPr>
-      <w:r>
-        <w:t>9. GestureDiagnosticsLogger registra eventos de diagnóstico en archivos JSONL para análisis posterior de confusiones y ajuste de perfiles.</w:t>
+        <w:t>7. VoiceCommandController escucha audio en loop, clasifica módulo y comando con modelos ML (.pkl) y ejecuta la acción correspondiente.</w:t>
       </w:r>
     </w:p>
     <w:p>
@@ -196,233 +180,6 @@
     <w:p>
       <w:r>
         <w:t>Cada gesto tiene: escala de umbral, delta mínimo absoluto (evita ruido de baseline) y contador de frames de debounce (N frames consecutivos antes de reportar). La base neutral se adapta lentamente (adaptation_alpha=0.01) cuando ningún gesto está activo.</w:t>
-      </w:r>
-    </w:p>
-    <w:p>
-      <w:r>
-        <w:t>Además de los booleanos tradicionales, el detector genera gesture_scores por gesto:</w:t>
-      </w:r>
-    </w:p>
-    <w:p>
-      <w:pPr>
-        <w:pStyle w:val="ListBullet"/>
-      </w:pPr>
-      <w:r>
-        <w:t>score: intensidad normalizada sobre el umbral.</w:t>
-      </w:r>
-    </w:p>
-    <w:p>
-      <w:pPr>
-        <w:pStyle w:val="ListBullet"/>
-      </w:pPr>
-      <w:r>
-        <w:t>threshold: umbral normalizado (siempre 1.0 en la escala interna).</w:t>
-      </w:r>
-    </w:p>
-    <w:p>
-      <w:pPr>
-        <w:pStyle w:val="ListBullet"/>
-      </w:pPr>
-      <w:r>
-        <w:t>margin: score - threshold (positivo = superó el umbral).</w:t>
-      </w:r>
-    </w:p>
-    <w:p>
-      <w:pPr>
-        <w:pStyle w:val="ListBullet"/>
-      </w:pPr>
-      <w:r>
-        <w:t>confidence: ratio score/threshold clampeado a [0, 1].</w:t>
-      </w:r>
-    </w:p>
-    <w:p>
-      <w:pPr>
-        <w:pStyle w:val="ListBullet"/>
-      </w:pPr>
-      <w:r>
-        <w:t>active_raw: True si el gesto superó el umbral antes del debounce.</w:t>
-      </w:r>
-    </w:p>
-    <w:p>
-      <w:pPr>
-        <w:pStyle w:val="ListBullet"/>
-      </w:pPr>
-      <w:r>
-        <w:t>detail: descripción de qué métricas contribuyeron al score.</w:t>
-      </w:r>
-    </w:p>
-    <w:p>
-      <w:pPr>
-        <w:pStyle w:val="Heading2"/>
-      </w:pPr>
-      <w:r>
-        <w:t>Arbitraje de gestos (GestureArbiter)</w:t>
-      </w:r>
-    </w:p>
-    <w:p>
-      <w:r>
-        <w:t>GestureArbiter recibe los booleanos y gesture_scores del detector y produce un único conjunto de gestos ganadores por frame. Sus responsabilidades son:</w:t>
-      </w:r>
-    </w:p>
-    <w:p>
-      <w:pPr>
-        <w:pStyle w:val="ListBullet"/>
-      </w:pPr>
-      <w:r>
-        <w:t>Resolver conflictos dentro de grupos (boca, sonrisa, ojos, cejas): solo un gesto del grupo puede estar activo. En caso de empate, desempata por confidence o priority.</w:t>
-      </w:r>
-    </w:p>
-    <w:p>
-      <w:pPr>
-        <w:pStyle w:val="ListBullet"/>
-      </w:pPr>
-      <w:r>
-        <w:t>Aplicar estabilidad temporal: activation_frames (frames consecutivos requeridos para activar) y release_frames (frames de ausencia requeridos para liberar). Gestos key_hold tienen hold_activation_frames y hold_release_frames independientes para menor latencia.</w:t>
-      </w:r>
-    </w:p>
-    <w:p>
-      <w:pPr>
-        <w:pStyle w:val="ListBullet"/>
-      </w:pPr>
-      <w:r>
-        <w:t>Modo realtime: si gesture_scores.active_raw=True y confidence &gt;= realtime_confidence y margin &gt;= realtime_margin, activa el gesto sin esperar el debounce completo del detector. Solo aplica a los tipos de acción listados en realtime_action_types (default: hotkey, key_hold).</w:t>
-      </w:r>
-    </w:p>
-    <w:p>
-      <w:pPr>
-        <w:pStyle w:val="ListBullet"/>
-      </w:pPr>
-      <w:r>
-        <w:t>Producir last_debug con candidatos, descartados, puntajes y frames de activación por grupo, para diagnóstico en vivo y logs.</w:t>
-      </w:r>
-    </w:p>
-    <w:p>
-      <w:r>
-        <w:t>Configuración relevante en gesture_arbitration (default_config.json):</w:t>
-      </w:r>
-    </w:p>
-    <w:p>
-      <w:r>
-        <w:t>"mode": "realtime" | "balanced"</w:t>
-        <w:br/>
-        <w:t>"realtime_confidence": 0.85  (umbral de confianza para fast path)</w:t>
-        <w:br/>
-        <w:t>"realtime_margin": 0.15  (margen mínimo sobre umbral)</w:t>
-        <w:br/>
-        <w:t>"realtime_action_types": ["hotkey", "key_hold"]</w:t>
-        <w:br/>
-        <w:t>"activation_frames": 2  (default para gestos normales)</w:t>
-        <w:br/>
-        <w:t>"hold_activation_frames": 1  (default para key_hold)</w:t>
-        <w:br/>
-        <w:t>"release_frames": 2  (default)</w:t>
-        <w:br/>
-        <w:t>"hold_release_frames": 1  (default para key_hold)</w:t>
-        <w:br/>
-        <w:t>"activation_frames_by_gesture": {"mouth_o": 3, "brow_raise": 3, ...}  (por gesto)</w:t>
-      </w:r>
-    </w:p>
-    <w:p>
-      <w:pPr>
-        <w:pStyle w:val="Heading2"/>
-      </w:pPr>
-      <w:r>
-        <w:t>Modos de acción por gesto</w:t>
-      </w:r>
-    </w:p>
-    <w:p>
-      <w:r>
-        <w:t>En Configuración → Gestos → Acciones, cada gesto puede configurarse con dos modos mediante un switch 'Mantener':</w:t>
-      </w:r>
-    </w:p>
-    <w:p>
-      <w:pPr>
-        <w:pStyle w:val="ListBullet"/>
-      </w:pPr>
-      <w:r>
-        <w:t>hotkey (switch apagado): pulsa la tecla una vez por cada activación del gesto. Útil para acciones discretas: Enter, Tab, Esc, atajos de teclado.</w:t>
-      </w:r>
-    </w:p>
-    <w:p>
-      <w:pPr>
-        <w:pStyle w:val="ListBullet"/>
-      </w:pPr>
-      <w:r>
-        <w:t>key_hold (switch encendido): mantiene la tecla presionada mientras el gesto esté activo y la suelta al terminar. Útil para movimiento continuo en juegos: flechas, WASD.</w:t>
-      </w:r>
-    </w:p>
-    <w:p>
-      <w:r>
-        <w:t>Para juegos, se recomienda usar key_hold con el perfil 'Juego simple'. Ese perfil activa hold_activation_frames=1 y hold_release_frames=1 y tiene un gesture_cooldown de 0.15 s para máxima respuesta. Las acciones discretas (saltar, confirmar) usan hotkey en el mismo perfil.</w:t>
-      </w:r>
-    </w:p>
-    <w:p>
-      <w:pPr>
-        <w:pStyle w:val="Heading2"/>
-      </w:pPr>
-      <w:r>
-        <w:t>Perfiles incluidos</w:t>
-      </w:r>
-    </w:p>
-    <w:p>
-      <w:pPr>
-        <w:pStyle w:val="ListBullet"/>
-      </w:pPr>
-      <w:r>
-        <w:t>navegacion: Acciones de edición y navegación (copiar, pegar, Enter, Tab, Eliminar, barra de url). Mouse habilitado.</w:t>
-      </w:r>
-    </w:p>
-    <w:p>
-      <w:pPr>
-        <w:pStyle w:val="ListBullet"/>
-      </w:pPr>
-      <w:r>
-        <w:t>accesibilidad_pc: Control de escritorio completo (Tab/Shift-Tab para controles, Enter para activar, Esc para volver, click/doble-click, PageUp/PageDown). Mouse habilitado.</w:t>
-      </w:r>
-    </w:p>
-    <w:p>
-      <w:pPr>
-        <w:pStyle w:val="ListBullet"/>
-      </w:pPr>
-      <w:r>
-        <w:t>juego_simple: Movimiento con key_hold (flechas), salto con space, confirmación con Enter, pausa con Esc. Cooldown de 0.15 s. Mouse deshabilitado.</w:t>
-      </w:r>
-    </w:p>
-    <w:p>
-      <w:pPr>
-        <w:pStyle w:val="Heading2"/>
-      </w:pPr>
-      <w:r>
-        <w:t>Cooldown configurable</w:t>
-      </w:r>
-    </w:p>
-    <w:p>
-      <w:r>
-        <w:t>El cooldown entre activaciones de un mismo gesto puede configurarse en tres niveles:</w:t>
-      </w:r>
-    </w:p>
-    <w:p>
-      <w:pPr>
-        <w:pStyle w:val="ListBullet"/>
-      </w:pPr>
-      <w:r>
-        <w:t>Global: gesture_cooldown en default_config.json (default 0.3 s). Aplica a todos los perfiles que no tengan override propio.</w:t>
-      </w:r>
-    </w:p>
-    <w:p>
-      <w:pPr>
-        <w:pStyle w:val="ListBullet"/>
-      </w:pPr>
-      <w:r>
-        <w:t>Por perfil: gesture_cooldown dentro de la sección del perfil en profiles. Permite que un perfil de juego use 0.15 s sin afectar los demás.</w:t>
-      </w:r>
-    </w:p>
-    <w:p>
-      <w:pPr>
-        <w:pStyle w:val="ListBullet"/>
-      </w:pPr>
-      <w:r>
-        <w:t>Sin cooldown para key_hold: las acciones de tipo key_hold no usan cooldown, ya que su activación y liberación dependen de si el gesto está activo.</w:t>
       </w:r>
     </w:p>
     <w:p>
@@ -527,66 +284,6 @@
         <w:pStyle w:val="Heading2"/>
       </w:pPr>
       <w:r>
-        <w:t>Diagnóstico en vivo y logs</w:t>
-      </w:r>
-    </w:p>
-    <w:p>
-      <w:r>
-        <w:t>La vista Inicio muestra una tarjeta de diagnóstico en tiempo real con:</w:t>
-      </w:r>
-    </w:p>
-    <w:p>
-      <w:pPr>
-        <w:pStyle w:val="ListBullet"/>
-      </w:pPr>
-      <w:r>
-        <w:t>Ganador: gesto filtrado por el árbitro que puede ejecutar una acción.</w:t>
-      </w:r>
-    </w:p>
-    <w:p>
-      <w:pPr>
-        <w:pStyle w:val="ListBullet"/>
-      </w:pPr>
-      <w:r>
-        <w:t>Crudos: gestos que el detector facial vio antes del arbitraje.</w:t>
-      </w:r>
-    </w:p>
-    <w:p>
-      <w:pPr>
-        <w:pStyle w:val="ListBullet"/>
-      </w:pPr>
-      <w:r>
-        <w:t>Descartados: gestos rechazados por competir con otro gesto del mismo grupo.</w:t>
-      </w:r>
-    </w:p>
-    <w:p>
-      <w:pPr>
-        <w:pStyle w:val="ListBullet"/>
-      </w:pPr>
-      <w:r>
-        <w:t>Frames de activación: cuántos frames lleva el candidato y cuántos necesita.</w:t>
-      </w:r>
-    </w:p>
-    <w:p>
-      <w:r>
-        <w:t>GestureDiagnosticsLogger guarda eventos en JSONL para revisión posterior:</w:t>
-      </w:r>
-    </w:p>
-    <w:p>
-      <w:r>
-        <w:t>Ruta: logs/gesture_diagnostics/gesture_diagnostics_ui_YYYYMMDD_HHMMSS.jsonl</w:t>
-      </w:r>
-    </w:p>
-    <w:p>
-      <w:r>
-        <w:t>Cada línea contiene: profile, detected_gesture, debug.raw_active, debug.active, debug.groups (candidatos, descartados, puntajes, frames requeridos). Configurable con min_interval_seconds y only_log_changes.</w:t>
-      </w:r>
-    </w:p>
-    <w:p>
-      <w:pPr>
-        <w:pStyle w:val="Heading2"/>
-      </w:pPr>
-      <w:r>
         <w:t>Interfaz de usuario (v0.3)</w:t>
       </w:r>
     </w:p>
@@ -600,7 +297,7 @@
         <w:pStyle w:val="ListBullet"/>
       </w:pPr>
       <w:r>
-        <w:t>Inicio: preview de cámara (hilo dedicado), badge de gesto detectado, métricas faciales (boca, ojos, cejas, sonrisa), estado de módulos (gestos/mouse/voz), panel 'Voz en vivo' (estado / módulo / comando / advertencia de confianza), tarjeta de diagnóstico de gestos (ganador/crudos/descartados).</w:t>
+        <w:t>Inicio: preview de cámara (hilo dedicado), badge de gesto detectado, métricas faciales (boca, ojos, cejas, sonrisa), estado de módulos (gestos/mouse/voz), panel 'Voz en vivo' (estado / módulo / comando / advertencia de confianza).</w:t>
       </w:r>
     </w:p>
     <w:p>
@@ -608,7 +305,7 @@
         <w:pStyle w:val="ListBullet"/>
       </w:pPr>
       <w:r>
-        <w:t>Configuración: tabs Gestos→Acciones / Perfiles / Mouse. En Gestos→Acciones cada gesto muestra la tecla mapeada y un switch 'Mantener' (hotkey vs key_hold). Panel derecho con toggle de Control de voz, resumen de mouse y chip de perfil activo.</w:t>
+        <w:t>Configuración: tabs Gestos→Acciones / Perfiles / Mouse. Panel derecho con toggle de Control de voz, resumen de mouse (estado/velocidad/zona muerta/suavizado), chip de perfil activo y lista de otros perfiles.</w:t>
       </w:r>
     </w:p>
     <w:p>
@@ -642,7 +339,7 @@
     </w:p>
     <w:p>
       <w:r>
-        <w:t>La configuración se persiste en config/user_settings.json (merge sobre default_config.json). Cada perfil contiene: gesture_thresholds, gesture_actions (con type: hotkey o key_hold por gesto), voice_actions, mouse_settings y opcionalmente gesture_cooldown propio. Los cambios se aplican sin reiniciar la app.</w:t>
+        <w:t>La configuración se persiste en config/user_settings.json (merge sobre default_config.json). Cada perfil contiene: gesture_thresholds, gesture_actions, voice_actions, mouse_settings. Los cambios se aplican sin reiniciar la app. Se pueden clonar perfiles.</w:t>
       </w:r>
     </w:p>
     <w:p>
@@ -702,7 +399,7 @@
           </w:tcPr>
           <w:p>
             <w:r>
-              <w:t>Ventana principal: UI + bucle de cámara + lógica de gestos/voz/diagnóstico</w:t>
+              <w:t>Ventana principal (~1900 líneas): UI + bucle de cámara + lógica de gestos/voz</w:t>
             </w:r>
           </w:p>
         </w:tc>
@@ -724,7 +421,7 @@
           </w:tcPr>
           <w:p>
             <w:r>
-              <w:t>Capa de acceso a config: get/set de perfiles, umbrales, mouse, voz, cooldown</w:t>
+              <w:t>Capa de acceso a config: get/set de perfiles, umbrales, mouse, voz</w:t>
             </w:r>
           </w:p>
         </w:tc>
@@ -746,7 +443,7 @@
           </w:tcPr>
           <w:p>
             <w:r>
-              <w:t>FacialGestureDetector: calibración neutral, debounce, gesture_scores</w:t>
+              <w:t>FacialGestureDetector con calibración neutral adaptativa</w:t>
             </w:r>
           </w:p>
         </w:tc>
@@ -769,50 +466,6 @@
           <w:p>
             <w:r>
               <w:t>MediaPipeFaceDetector (landmarks + blendshapes + nose_tip)</w:t>
-            </w:r>
-          </w:p>
-        </w:tc>
-      </w:tr>
-      <w:tr>
-        <w:tc>
-          <w:tcPr>
-            <w:tcW w:type="dxa" w:w="4320"/>
-          </w:tcPr>
-          <w:p>
-            <w:r>
-              <w:t>core/gesture_engine/gesture_arbiter.py</w:t>
-            </w:r>
-          </w:p>
-        </w:tc>
-        <w:tc>
-          <w:tcPr>
-            <w:tcW w:type="dxa" w:w="4320"/>
-          </w:tcPr>
-          <w:p>
-            <w:r>
-              <w:t>GestureArbiter: arbitraje, estabilidad, modo realtime, debug</w:t>
-            </w:r>
-          </w:p>
-        </w:tc>
-      </w:tr>
-      <w:tr>
-        <w:tc>
-          <w:tcPr>
-            <w:tcW w:type="dxa" w:w="4320"/>
-          </w:tcPr>
-          <w:p>
-            <w:r>
-              <w:t>core/gesture_engine/gesture_diagnostics_logger.py</w:t>
-            </w:r>
-          </w:p>
-        </w:tc>
-        <w:tc>
-          <w:tcPr>
-            <w:tcW w:type="dxa" w:w="4320"/>
-          </w:tcPr>
-          <w:p>
-            <w:r>
-              <w:t>GestureDiagnosticsLogger: logs JSONL de sesión</w:t>
             </w:r>
           </w:p>
         </w:tc>
@@ -900,7 +553,7 @@
           </w:tcPr>
           <w:p>
             <w:r>
-              <w:t>Ejecución de hotkeys/key_hold/clicks con pyautogui</w:t>
+              <w:t>Ejecución de hotkeys/clicks con pydirectinput</w:t>
             </w:r>
           </w:p>
         </w:tc>
@@ -922,7 +575,7 @@
           </w:tcPr>
           <w:p>
             <w:r>
-              <w:t>Config por defecto: perfiles, umbrales, arbitraje, voz, mouse, cooldown</w:t>
+              <w:t>Config por defecto: perfiles, umbrales, voz, mouse</w:t>
             </w:r>
           </w:p>
         </w:tc>

</xml_diff>